<commit_message>
Address final Answer, service, and discovery feedback
</commit_message>
<xml_diff>
--- a/docassemble/MAEvictionDefense/data/templates/SummaryProcessAnswer.docx
+++ b/docassemble/MAEvictionDefense/data/templates/SummaryProcessAnswer.docx
@@ -1140,22 +1140,27 @@
       </w:r>
       <w:proofErr w:type="spellStart"/>
       <w:r>
+        <w:t>showifdef</w:t>
+      </w:r>
+      <w:proofErr w:type="spellEnd"/>
+      <w:r>
+        <w:t>('</w:t>
+      </w:r>
+      <w:proofErr w:type="spellStart"/>
+      <w:r>
         <w:t>initial_</w:t>
       </w:r>
       <w:proofErr w:type="gramStart"/>
       <w:r>
-        <w:t>defense.</w:t>
-      </w:r>
-      <w:r>
-        <w:t>avoidance</w:t>
-      </w:r>
-      <w:proofErr w:type="gramEnd"/>
-      <w:r>
-        <w:t>_of_forfeiture</w:t>
-      </w:r>
-      <w:proofErr w:type="spellEnd"/>
-      <w:r>
-        <w:t xml:space="preserve"> %}</w:t>
+        <w:t>defense.custom</w:t>
+      </w:r>
+      <w:proofErr w:type="gramEnd"/>
+      <w:r>
+        <w:t>_reason_for_dismissal</w:t>
+      </w:r>
+      <w:proofErr w:type="spellEnd"/>
+      <w:r>
+        <w:t>') %}</w:t>
       </w:r>
     </w:p>
     <w:p>
@@ -1168,7 +1173,23 @@
         <w:suppressAutoHyphens/>
       </w:pPr>
       <w:r>
-        <w:t>Based on principles of equity and fairness, it is unfair to evict me.</w:t>
+        <w:t xml:space="preserve">The landlord’s case should be dismissed because </w:t>
+      </w:r>
+      <w:proofErr w:type="gramStart"/>
+      <w:r>
+        <w:t xml:space="preserve">{{ </w:t>
+      </w:r>
+      <w:proofErr w:type="spellStart"/>
+      <w:r>
+        <w:t>initial</w:t>
+      </w:r>
+      <w:proofErr w:type="gramEnd"/>
+      <w:r>
+        <w:t>_defense.custom_reason_for_dismissal</w:t>
+      </w:r>
+      <w:proofErr w:type="spellEnd"/>
+      <w:r>
+        <w:t xml:space="preserve"> }}.</w:t>
       </w:r>
     </w:p>
     <w:p>
@@ -1186,15 +1207,10 @@
         <w:ind w:left="360"/>
       </w:pPr>
       <w:r>
-        <w:t xml:space="preserve">{%p if </w:t>
-      </w:r>
-      <w:proofErr w:type="spellStart"/>
-      <w:r>
-        <w:t>showifdef</w:t>
-      </w:r>
-      <w:proofErr w:type="spellEnd"/>
-      <w:r>
-        <w:t>('</w:t>
+        <w:t xml:space="preserve">{%p </w:t>
+      </w:r>
+      <w:r>
+        <w:t xml:space="preserve">if </w:t>
       </w:r>
       <w:proofErr w:type="spellStart"/>
       <w:r>
@@ -1202,15 +1218,15 @@
       </w:r>
       <w:proofErr w:type="gramStart"/>
       <w:r>
-        <w:t>defense.custom</w:t>
-      </w:r>
-      <w:proofErr w:type="gramEnd"/>
-      <w:r>
-        <w:t>_reason_for_dismissal</w:t>
-      </w:r>
-      <w:proofErr w:type="spellEnd"/>
-      <w:r>
-        <w:t>') %}</w:t>
+        <w:t>defense.local</w:t>
+      </w:r>
+      <w:proofErr w:type="gramEnd"/>
+      <w:r>
+        <w:t>_occupancy_ordinance</w:t>
+      </w:r>
+      <w:proofErr w:type="spellEnd"/>
+      <w:r>
+        <w:t xml:space="preserve"> %}</w:t>
       </w:r>
     </w:p>
     <w:p>
@@ -1223,23 +1239,7 @@
         <w:suppressAutoHyphens/>
       </w:pPr>
       <w:r>
-        <w:t xml:space="preserve">The landlord’s case should be dismissed because </w:t>
-      </w:r>
-      <w:proofErr w:type="gramStart"/>
-      <w:r>
-        <w:t xml:space="preserve">{{ </w:t>
-      </w:r>
-      <w:proofErr w:type="spellStart"/>
-      <w:r>
-        <w:t>initial</w:t>
-      </w:r>
-      <w:proofErr w:type="gramEnd"/>
-      <w:r>
-        <w:t>_defense.custom_reason_for_dismissal</w:t>
-      </w:r>
-      <w:proofErr w:type="spellEnd"/>
-      <w:r>
-        <w:t xml:space="preserve"> }}.</w:t>
+        <w:t>The landlord may not have been allowed to collect rent without the required local permit or certification.</w:t>
       </w:r>
     </w:p>
     <w:p>
@@ -1248,7 +1248,52 @@
         <w:ind w:left="360"/>
       </w:pPr>
       <w:r>
-        <w:t>{%p endif %}</w:t>
+        <w:t xml:space="preserve">{%p if </w:t>
+      </w:r>
+      <w:proofErr w:type="spellStart"/>
+      <w:r>
+        <w:t>showifdef</w:t>
+      </w:r>
+      <w:proofErr w:type="spellEnd"/>
+      <w:r>
+        <w:t>('</w:t>
+      </w:r>
+      <w:proofErr w:type="spellStart"/>
+      <w:r>
+        <w:t>local_occupancy_ordinance_defense_summary</w:t>
+      </w:r>
+      <w:proofErr w:type="spellEnd"/>
+      <w:r>
+        <w:t>') %}</w:t>
+      </w:r>
+    </w:p>
+    <w:p>
+      <w:pPr>
+        <w:pStyle w:val="ListwithNoSpace"/>
+        <w:numPr>
+          <w:ilvl w:val="0"/>
+          <w:numId w:val="14"/>
+        </w:numPr>
+        <w:suppressAutoHyphens/>
+      </w:pPr>
+      <w:r>
+        <w:t xml:space="preserve"> </w:t>
+      </w:r>
+      <w:proofErr w:type="gramStart"/>
+      <w:r>
+        <w:t xml:space="preserve">{{ </w:t>
+      </w:r>
+      <w:proofErr w:type="spellStart"/>
+      <w:r>
+        <w:t>local</w:t>
+      </w:r>
+      <w:proofErr w:type="gramEnd"/>
+      <w:r>
+        <w:t>_occupancy_ordinance_defense_summary</w:t>
+      </w:r>
+      <w:proofErr w:type="spellEnd"/>
+      <w:r>
+        <w:t xml:space="preserve"> }}</w:t>
       </w:r>
     </w:p>
     <w:p>
@@ -1257,10 +1302,25 @@
         <w:ind w:left="360"/>
       </w:pPr>
       <w:r>
-        <w:t xml:space="preserve">{%p </w:t>
-      </w:r>
-      <w:r>
-        <w:t xml:space="preserve">if </w:t>
+        <w:t>{%p endif %}</w:t>
+      </w:r>
+    </w:p>
+    <w:p>
+      <w:pPr>
+        <w:pStyle w:val="ListwithNoSpace"/>
+        <w:ind w:left="360"/>
+      </w:pPr>
+      <w:r>
+        <w:t>{%p endif %}</w:t>
+      </w:r>
+    </w:p>
+    <w:p>
+      <w:pPr>
+        <w:pStyle w:val="ListwithNoSpace"/>
+        <w:ind w:left="360"/>
+      </w:pPr>
+      <w:r>
+        <w:t xml:space="preserve">{%p if </w:t>
       </w:r>
       <w:proofErr w:type="spellStart"/>
       <w:r>
@@ -1268,15 +1328,36 @@
       </w:r>
       <w:proofErr w:type="gramStart"/>
       <w:r>
-        <w:t>defense.local</w:t>
-      </w:r>
-      <w:proofErr w:type="gramEnd"/>
-      <w:r>
-        <w:t>_occupancy_ordinance</w:t>
+        <w:t>defense.</w:t>
+      </w:r>
+      <w:r>
+        <w:t>avoidance</w:t>
+      </w:r>
+      <w:proofErr w:type="gramEnd"/>
+      <w:r>
+        <w:t>_of_forfeiture</w:t>
       </w:r>
       <w:proofErr w:type="spellEnd"/>
       <w:r>
         <w:t xml:space="preserve"> %}</w:t>
+      </w:r>
+    </w:p>
+    <w:p>
+      <w:pPr>
+        <w:pStyle w:val="Caption"/>
+        <w:spacing w:line="276" w:lineRule="auto"/>
+      </w:pPr>
+      <w:r>
+        <w:t>Defense</w:t>
+      </w:r>
+    </w:p>
+    <w:p>
+      <w:pPr>
+        <w:pStyle w:val="CenterTitle3"/>
+        <w:spacing w:line="276" w:lineRule="auto"/>
+      </w:pPr>
+      <w:r>
+        <w:t>Avoidance of Forfeiture</w:t>
       </w:r>
     </w:p>
     <w:p>
@@ -1289,70 +1370,7 @@
         <w:suppressAutoHyphens/>
       </w:pPr>
       <w:r>
-        <w:t>The landlord may not have been allowed to collect rent without the required local permit or certification.</w:t>
-      </w:r>
-    </w:p>
-    <w:p>
-      <w:pPr>
-        <w:pStyle w:val="ListwithNoSpace"/>
-        <w:ind w:left="360"/>
-      </w:pPr>
-      <w:r>
-        <w:t xml:space="preserve">{%p if </w:t>
-      </w:r>
-      <w:proofErr w:type="spellStart"/>
-      <w:r>
-        <w:t>showifdef</w:t>
-      </w:r>
-      <w:proofErr w:type="spellEnd"/>
-      <w:r>
-        <w:t>('</w:t>
-      </w:r>
-      <w:proofErr w:type="spellStart"/>
-      <w:r>
-        <w:t>local_occupancy_ordinance_defense_summary</w:t>
-      </w:r>
-      <w:proofErr w:type="spellEnd"/>
-      <w:r>
-        <w:t>') %}</w:t>
-      </w:r>
-    </w:p>
-    <w:p>
-      <w:pPr>
-        <w:pStyle w:val="ListwithNoSpace"/>
-        <w:numPr>
-          <w:ilvl w:val="0"/>
-          <w:numId w:val="14"/>
-        </w:numPr>
-        <w:suppressAutoHyphens/>
-      </w:pPr>
-      <w:r>
-        <w:t xml:space="preserve"> </w:t>
-      </w:r>
-      <w:proofErr w:type="gramStart"/>
-      <w:r>
-        <w:t xml:space="preserve">{{ </w:t>
-      </w:r>
-      <w:proofErr w:type="spellStart"/>
-      <w:r>
-        <w:t>local</w:t>
-      </w:r>
-      <w:proofErr w:type="gramEnd"/>
-      <w:r>
-        <w:t>_occupancy_ordinance_defense_summary</w:t>
-      </w:r>
-      <w:proofErr w:type="spellEnd"/>
-      <w:r>
-        <w:t xml:space="preserve"> }}</w:t>
-      </w:r>
-    </w:p>
-    <w:p>
-      <w:pPr>
-        <w:pStyle w:val="ListwithNoSpace"/>
-        <w:ind w:left="360"/>
-      </w:pPr>
-      <w:r>
-        <w:t>{%p endif %}</w:t>
+        <w:t>Based on principles of equity and fairness, it is unfair to evict me from my home.</w:t>
       </w:r>
     </w:p>
     <w:p>

</xml_diff>